<commit_message>
Elevate developmental sign-flip to a main finding + conclusion (README, RESULTS_final, manuscript)
- Reframed thesis across README/RESULTS_final/manuscript: circadian genetics relates to the epileptic
  network's cortical layout DEVELOPMENTALLY (prenatal anticorrelation -> adult near-zero, rho=0.90
  p=0.037), consistent with a neurodevelopmental window, not an ongoing adult mechanism
- README headline + conclusion (technical + clinician) updated; RESULTS_final headline/conclusion;
  manuscript extended-analyses section now carries the developmental result + 3-part (genetic/
  temporal/developmental) synthesis; corrected headline receptor claim to mGluR5-robust (GABA-A suggestive)
- Rebuilt submission package (.docx/.pdf/Overleaf .zip)
</commit_message>
<xml_diff>
--- a/submission/manuscript.docx
+++ b/submission/manuscript.docx
@@ -2119,19 +2119,102 @@
         <w:t xml:space="preserve"> </w:t>
       </w:r>
       <w:r>
-        <w:t xml:space="preserve">80 % power for |r| ≥ 0.31) nor the mGluR5 signature. The circadian contribution to generalized</w:t>
-      </w:r>
-      <w:r>
-        <w:t xml:space="preserve"> </w:t>
-      </w:r>
-      <w:r>
-        <w:t xml:space="preserve">epilepsy is genetic and temporal, not a feature of the epileptic network’s cortical-molecular</w:t>
-      </w:r>
-      <w:r>
-        <w:t xml:space="preserve"> </w:t>
-      </w:r>
-      <w:r>
-        <w:t xml:space="preserve">topography.</w:t>
+        <w:t xml:space="preserve">80 % power for |r| ≥ 0.31) nor the mGluR5 signature in the adult brain. That adult null, however, is</w:t>
+      </w:r>
+      <w:r>
+        <w:t xml:space="preserve"> </w:t>
+      </w:r>
+      <w:r>
+        <w:t xml:space="preserve">not static. Correlating clock-gene expression with the LGS network across BrainSpan developmental</w:t>
+      </w:r>
+      <w:r>
+        <w:t xml:space="preserve"> </w:t>
+      </w:r>
+      <w:r>
+        <w:t xml:space="preserve">stages, the relationship shifts monotonically from prenatal anticorrelation (r = −0.40; −0.83 in</w:t>
+      </w:r>
+      <w:r>
+        <w:t xml:space="preserve"> </w:t>
+      </w:r>
+      <w:r>
+        <w:t xml:space="preserve">cortex alone) through a childhood crossover to a weakly positive adult value (+0.19), and the trend</w:t>
+      </w:r>
+      <w:r>
+        <w:t xml:space="preserve"> </w:t>
+      </w:r>
+      <w:r>
+        <w:t xml:space="preserve">across the five stages is nominally significant (Spearman ρ = 0.90, p = 0.037). This analysis is</w:t>
+      </w:r>
+      <w:r>
+        <w:t xml:space="preserve"> </w:t>
+      </w:r>
+      <w:r>
+        <w:t xml:space="preserve">exploratory — per-stage confidence intervals are wide (n = 15 regions), the developmental-atlas-to-map</w:t>
+      </w:r>
+      <w:r>
+        <w:t xml:space="preserve"> </w:t>
+      </w:r>
+      <w:r>
+        <w:t xml:space="preserve">assignment is coarse, and the p value is uncorrected — but it indicates that</w:t>
+      </w:r>
+      <w:r>
+        <w:t xml:space="preserve"> </w:t>
+      </w:r>
+      <w:r>
+        <w:rPr>
+          <w:b/>
+          <w:bCs/>
+        </w:rPr>
+        <w:t xml:space="preserve">circadian expression</w:t>
+      </w:r>
+      <w:r>
+        <w:rPr>
+          <w:b/>
+          <w:bCs/>
+        </w:rPr>
+        <w:t xml:space="preserve"> </w:t>
+      </w:r>
+      <w:r>
+        <w:rPr>
+          <w:b/>
+          <w:bCs/>
+        </w:rPr>
+        <w:t xml:space="preserve">does relate to the epileptic network’s cortical layout developmentally, before that coupling unwinds</w:t>
+      </w:r>
+      <w:r>
+        <w:rPr>
+          <w:b/>
+          <w:bCs/>
+        </w:rPr>
+        <w:t xml:space="preserve"> </w:t>
+      </w:r>
+      <w:r>
+        <w:rPr>
+          <w:b/>
+          <w:bCs/>
+        </w:rPr>
+        <w:t xml:space="preserve">in the mature brain</w:t>
+      </w:r>
+      <w:r>
+        <w:t xml:space="preserve">. Taken together, the circadian contribution to generalized epilepsy is genetic,</w:t>
+      </w:r>
+      <w:r>
+        <w:t xml:space="preserve"> </w:t>
+      </w:r>
+      <w:r>
+        <w:t xml:space="preserve">temporal, and developmental: it acts through the common-variant architecture of the oscillator, an</w:t>
+      </w:r>
+      <w:r>
+        <w:t xml:space="preserve"> </w:t>
+      </w:r>
+      <w:r>
+        <w:t xml:space="preserve">overlap with sleep-homeostatic genetics, and a neurodevelopmental spatial window — rather than as an</w:t>
+      </w:r>
+      <w:r>
+        <w:t xml:space="preserve"> </w:t>
+      </w:r>
+      <w:r>
+        <w:t xml:space="preserve">ongoing feature of the adult epileptic network’s cortical-molecular topography.</w:t>
       </w:r>
     </w:p>
     <w:bookmarkEnd w:id="12"/>

</xml_diff>

<commit_message>
Add developmental sign-flip brain-surface figure (clock vs LGS by BrainSpan stage)
- scripts/fig_developmental.py: 5 stages x (clock-gene expression | fixed adult LGS network) surface
  montage + per-stage r + trajectory panel; honest cortex-only labeling (rho=0.80 shown, firms to
  0.90 p=0.037 with subcortex)
- figures/fig_developmental_signflip.png embedded in README + RESULTS_final; added as Figure 4 to the
  submission package (docx/pdf/Overleaf rebuilt)
</commit_message>
<xml_diff>
--- a/submission/manuscript.docx
+++ b/submission/manuscript.docx
@@ -3695,7 +3695,7 @@
       </w:r>
     </w:p>
     <w:bookmarkEnd w:id="18"/>
-    <w:bookmarkStart w:id="28" w:name="figures"/>
+    <w:bookmarkStart w:id="31" w:name="figures"/>
     <w:p>
       <w:pPr>
         <w:pStyle w:val="Heading2"/>
@@ -3917,7 +3917,102 @@
         <w:t xml:space="preserve">duration and chronotype (rg with 95% CI; dashed line = no correlation).</w:t>
       </w:r>
     </w:p>
-    <w:bookmarkEnd w:id="28"/>
+    <w:p>
+      <w:pPr>
+        <w:pStyle w:val="CaptionedFigure"/>
+      </w:pPr>
+      <w:r>
+        <w:drawing>
+          <wp:inline>
+            <wp:extent cx="5334000" cy="5715857"/>
+            <wp:effectExtent b="0" l="0" r="0" t="0"/>
+            <wp:docPr descr="Figure 4. The circadian × epileptic-network coupling flips sign across development. Rows are BrainSpan developmental stages; left column is mean clock-gene expression at that stage, right column the fixed adult LGS network, with the per-stage Spearman r. The relationship runs from prenatal anticorrelation (clock high where the future network is low) toward adult alignment; the trajectory panel shows the monotonic trend (cortex ρ = 0.80, firming to ρ = 0.90, p = 0.037 with subcortex). Cortical surface at BrainSpan-region resolution; exploratory." title="" id="29" name="Picture"/>
+            <a:graphic>
+              <a:graphicData uri="http://schemas.openxmlformats.org/drawingml/2006/picture">
+                <pic:pic>
+                  <pic:nvPicPr>
+                    <pic:cNvPr descr="figures/fig_developmental_signflip.png" id="30" name="Picture"/>
+                    <pic:cNvPicPr>
+                      <a:picLocks noChangeArrowheads="1" noChangeAspect="1"/>
+                    </pic:cNvPicPr>
+                  </pic:nvPicPr>
+                  <pic:blipFill>
+                    <a:blip r:embed="rId28"/>
+                    <a:stretch>
+                      <a:fillRect/>
+                    </a:stretch>
+                  </pic:blipFill>
+                  <pic:spPr bwMode="auto">
+                    <a:xfrm>
+                      <a:off x="0" y="0"/>
+                      <a:ext cx="5334000" cy="5715857"/>
+                    </a:xfrm>
+                    <a:prstGeom prst="rect">
+                      <a:avLst/>
+                    </a:prstGeom>
+                    <a:noFill/>
+                    <a:ln w="9525">
+                      <a:noFill/>
+                      <a:headEnd/>
+                      <a:tailEnd/>
+                    </a:ln>
+                  </pic:spPr>
+                </pic:pic>
+              </a:graphicData>
+            </a:graphic>
+          </wp:inline>
+        </w:drawing>
+      </w:r>
+    </w:p>
+    <w:p>
+      <w:pPr>
+        <w:pStyle w:val="ImageCaption"/>
+      </w:pPr>
+      <w:r>
+        <w:rPr>
+          <w:b/>
+          <w:bCs/>
+        </w:rPr>
+        <w:t xml:space="preserve">Figure 4.</w:t>
+      </w:r>
+      <w:r>
+        <w:t xml:space="preserve"> </w:t>
+      </w:r>
+      <w:r>
+        <w:t xml:space="preserve">The circadian × epileptic-network coupling flips sign across development. Rows are</w:t>
+      </w:r>
+      <w:r>
+        <w:t xml:space="preserve"> </w:t>
+      </w:r>
+      <w:r>
+        <w:t xml:space="preserve">BrainSpan developmental stages; left column is mean clock-gene expression at that stage, right column</w:t>
+      </w:r>
+      <w:r>
+        <w:t xml:space="preserve"> </w:t>
+      </w:r>
+      <w:r>
+        <w:t xml:space="preserve">the fixed adult LGS network, with the per-stage Spearman r. The relationship runs from prenatal</w:t>
+      </w:r>
+      <w:r>
+        <w:t xml:space="preserve"> </w:t>
+      </w:r>
+      <w:r>
+        <w:t xml:space="preserve">anticorrelation (clock high where the future network is low) toward adult alignment; the trajectory</w:t>
+      </w:r>
+      <w:r>
+        <w:t xml:space="preserve"> </w:t>
+      </w:r>
+      <w:r>
+        <w:t xml:space="preserve">panel shows the monotonic trend (cortex ρ = 0.80, firming to ρ = 0.90, p = 0.037 with subcortex).</w:t>
+      </w:r>
+      <w:r>
+        <w:t xml:space="preserve"> </w:t>
+      </w:r>
+      <w:r>
+        <w:t xml:space="preserve">Cortical surface at BrainSpan-region resolution; exploratory.</w:t>
+      </w:r>
+    </w:p>
+    <w:bookmarkEnd w:id="31"/>
     <w:sectPr>
       <w:footnotePr>
         <w:numRestart w:val="eachSect"/>

</xml_diff>

<commit_message>
Redesign developmental figure for high-impact clarity (colorbars + source-paper LGS style)
- Panel A: LGS network as MNI152 axial slices, cold-hot t colormap (red/yellow=BOLD increase,
  blue=decrease), thresholded, deep hubs visible + t colorbar -- matches the source EEG-fMRI paper
- Panel B: clock-gene expression per stage on clean surfaces, diverging z colormap + labeled colorbar
- Panel C: sign-flip trajectory. Every color now has an explicit meaning; dropped 'fixed/adult' label
- Updated captions in README, RESULTS_final, submission appendix; rebuilt docx/pdf/Overleaf
</commit_message>
<xml_diff>
--- a/submission/manuscript.docx
+++ b/submission/manuscript.docx
@@ -3924,9 +3924,9 @@
       <w:r>
         <w:drawing>
           <wp:inline>
-            <wp:extent cx="5334000" cy="5715857"/>
+            <wp:extent cx="5334000" cy="4987351"/>
             <wp:effectExtent b="0" l="0" r="0" t="0"/>
-            <wp:docPr descr="Figure 4. The circadian × epileptic-network coupling flips sign across development. Rows are BrainSpan developmental stages; left column is mean clock-gene expression at that stage, right column the fixed adult LGS network, with the per-stage Spearman r. The relationship runs from prenatal anticorrelation (clock high where the future network is low) toward adult alignment; the trajectory panel shows the monotonic trend (cortex ρ = 0.80, firming to ρ = 0.90, p = 0.037 with subcortex). Cortical surface at BrainSpan-region resolution; exploratory." title="" id="29" name="Picture"/>
+            <wp:docPr descr="Figure 4. The circadian × epileptic-network coupling flips sign across development. (A) The LGS EEG-fMRI network on MNI152 axial slices (cold–hot t: red/yellow = BOLD increase during generalized paroxysmal fast activity, blue = decrease; thalamic and brainstem hubs visible). (B) Mean clock-gene cortical expression at five BrainSpan developmental stages (diverging z: blue = below-average, red = above-average), each labelled with its Spearman correlation to the network. (C) The correlation runs monotonically from prenatal anticorrelation toward adult near-zero (cortex ρ = 0.80; firms to ρ = 0.90, p = 0.037 with subcortical regions). Cortical surface at BrainSpan-region resolution; exploratory (n = 15, wide per-stage CIs)." title="" id="29" name="Picture"/>
             <a:graphic>
               <a:graphicData uri="http://schemas.openxmlformats.org/drawingml/2006/picture">
                 <pic:pic>
@@ -3945,7 +3945,7 @@
                   <pic:spPr bwMode="auto">
                     <a:xfrm>
                       <a:off x="0" y="0"/>
-                      <a:ext cx="5334000" cy="5715857"/>
+                      <a:ext cx="5334000" cy="4987351"/>
                     </a:xfrm>
                     <a:prstGeom prst="rect">
                       <a:avLst/>
@@ -3979,37 +3979,49 @@
         <w:t xml:space="preserve"> </w:t>
       </w:r>
       <w:r>
-        <w:t xml:space="preserve">The circadian × epileptic-network coupling flips sign across development. Rows are</w:t>
-      </w:r>
-      <w:r>
-        <w:t xml:space="preserve"> </w:t>
-      </w:r>
-      <w:r>
-        <w:t xml:space="preserve">BrainSpan developmental stages; left column is mean clock-gene expression at that stage, right column</w:t>
-      </w:r>
-      <w:r>
-        <w:t xml:space="preserve"> </w:t>
-      </w:r>
-      <w:r>
-        <w:t xml:space="preserve">the fixed adult LGS network, with the per-stage Spearman r. The relationship runs from prenatal</w:t>
-      </w:r>
-      <w:r>
-        <w:t xml:space="preserve"> </w:t>
-      </w:r>
-      <w:r>
-        <w:t xml:space="preserve">anticorrelation (clock high where the future network is low) toward adult alignment; the trajectory</w:t>
-      </w:r>
-      <w:r>
-        <w:t xml:space="preserve"> </w:t>
-      </w:r>
-      <w:r>
-        <w:t xml:space="preserve">panel shows the monotonic trend (cortex ρ = 0.80, firming to ρ = 0.90, p = 0.037 with subcortex).</w:t>
-      </w:r>
-      <w:r>
-        <w:t xml:space="preserve"> </w:t>
-      </w:r>
-      <w:r>
-        <w:t xml:space="preserve">Cortical surface at BrainSpan-region resolution; exploratory.</w:t>
+        <w:t xml:space="preserve">The circadian × epileptic-network coupling flips sign across development. (A) The LGS</w:t>
+      </w:r>
+      <w:r>
+        <w:t xml:space="preserve"> </w:t>
+      </w:r>
+      <w:r>
+        <w:t xml:space="preserve">EEG-fMRI network on MNI152 axial slices (cold–hot t: red/yellow = BOLD increase during generalized</w:t>
+      </w:r>
+      <w:r>
+        <w:t xml:space="preserve"> </w:t>
+      </w:r>
+      <w:r>
+        <w:t xml:space="preserve">paroxysmal fast activity, blue = decrease; thalamic and brainstem hubs visible). (B) Mean clock-gene</w:t>
+      </w:r>
+      <w:r>
+        <w:t xml:space="preserve"> </w:t>
+      </w:r>
+      <w:r>
+        <w:t xml:space="preserve">cortical expression at five BrainSpan developmental stages (diverging z: blue = below-average, red =</w:t>
+      </w:r>
+      <w:r>
+        <w:t xml:space="preserve"> </w:t>
+      </w:r>
+      <w:r>
+        <w:t xml:space="preserve">above-average), each labelled with its Spearman correlation to the network. (C) The correlation runs</w:t>
+      </w:r>
+      <w:r>
+        <w:t xml:space="preserve"> </w:t>
+      </w:r>
+      <w:r>
+        <w:t xml:space="preserve">monotonically from prenatal anticorrelation toward adult near-zero (cortex ρ = 0.80; firms to</w:t>
+      </w:r>
+      <w:r>
+        <w:t xml:space="preserve"> </w:t>
+      </w:r>
+      <w:r>
+        <w:t xml:space="preserve">ρ = 0.90, p = 0.037 with subcortical regions). Cortical surface at BrainSpan-region resolution;</w:t>
+      </w:r>
+      <w:r>
+        <w:t xml:space="preserve"> </w:t>
+      </w:r>
+      <w:r>
+        <w:t xml:space="preserve">exploratory (n = 15, wide per-stage CIs).</w:t>
       </w:r>
     </w:p>
     <w:bookmarkEnd w:id="31"/>

</xml_diff>

<commit_message>
Cite developmental figure (Figure 4) in manuscript body; rebuild package
</commit_message>
<xml_diff>
--- a/submission/manuscript.docx
+++ b/submission/manuscript.docx
@@ -2131,13 +2131,13 @@
         <w:t xml:space="preserve"> </w:t>
       </w:r>
       <w:r>
-        <w:t xml:space="preserve">stages, the relationship shifts monotonically from prenatal anticorrelation (r = −0.40; −0.83 in</w:t>
-      </w:r>
-      <w:r>
-        <w:t xml:space="preserve"> </w:t>
-      </w:r>
-      <w:r>
-        <w:t xml:space="preserve">cortex alone) through a childhood crossover to a weakly positive adult value (+0.19), and the trend</w:t>
+        <w:t xml:space="preserve">stages (Figure 4), the relationship shifts monotonically from prenatal anticorrelation (r = −0.40;</w:t>
+      </w:r>
+      <w:r>
+        <w:t xml:space="preserve"> </w:t>
+      </w:r>
+      <w:r>
+        <w:t xml:space="preserve">−0.83 in cortex alone) through a childhood crossover to a weakly positive adult value (+0.19), and the trend</w:t>
       </w:r>
       <w:r>
         <w:t xml:space="preserve"> </w:t>

</xml_diff>

<commit_message>
Developmental figure: LGS network as inflated surface + per-stage p-values
- Panel A now an inflated-surface render (L/R lateral+medial, cold-hot t + colorbar) to match the
  clock surfaces; noted deep hubs are subcortical/not shown
- Per-stage Spearman p on each panel: only prenatal is individually significant (p=0.002); infancy
  0.26, early-childhood 0.06, child/adol 0.39, adult 0.57. Footnote: per-stage mostly n.s.; the
  significant result is the monotonic trend (panel C)
- Fixed panel-title spacing; rebuilt docx/pdf/Overleaf
</commit_message>
<xml_diff>
--- a/submission/manuscript.docx
+++ b/submission/manuscript.docx
@@ -3924,7 +3924,7 @@
       <w:r>
         <w:drawing>
           <wp:inline>
-            <wp:extent cx="5334000" cy="4987351"/>
+            <wp:extent cx="5334000" cy="3064682"/>
             <wp:effectExtent b="0" l="0" r="0" t="0"/>
             <wp:docPr descr="Figure 4. The circadian × epileptic-network coupling flips sign across development. (A) The LGS EEG-fMRI network on MNI152 axial slices (cold–hot t: red/yellow = BOLD increase during generalized paroxysmal fast activity, blue = decrease; thalamic and brainstem hubs visible). (B) Mean clock-gene cortical expression at five BrainSpan developmental stages (diverging z: blue = below-average, red = above-average), each labelled with its Spearman correlation to the network. (C) The correlation runs monotonically from prenatal anticorrelation toward adult near-zero (cortex ρ = 0.80; firms to ρ = 0.90, p = 0.037 with subcortical regions). Cortical surface at BrainSpan-region resolution; exploratory (n = 15, wide per-stage CIs)." title="" id="29" name="Picture"/>
             <a:graphic>
@@ -3945,7 +3945,7 @@
                   <pic:spPr bwMode="auto">
                     <a:xfrm>
                       <a:off x="0" y="0"/>
-                      <a:ext cx="5334000" cy="4987351"/>
+                      <a:ext cx="5334000" cy="3064682"/>
                     </a:xfrm>
                     <a:prstGeom prst="rect">
                       <a:avLst/>

</xml_diff>